<commit_message>
Better image of the best solution found for the binned decoder
</commit_message>
<xml_diff>
--- a/lw_post.docx
+++ b/lw_post.docx
@@ -3615,7 +3615,7 @@
         <w:pStyle w:val="BodyText"/>
       </w:pPr>
       <w:r>
-        <w:t xml:space="preserve">The search finds that the two free embeddings settle almost exactly antipodal to the pinned ones. The</w:t>
+        <w:t xml:space="preserve">The search finds that the two free embeddings settle almost antipodal to the pinned ones, much shorter than them, and slightly tilted, each toward the long embedding of the other pair. The</w:t>
       </w:r>
       <w:r>
         <w:t xml:space="preserve"> </w:t>
@@ -3677,7 +3677,7 @@
         <m:sSup>
           <m:e>
             <m:r>
-              <m:t>11.0</m:t>
+              <m:t>20.7</m:t>
             </m:r>
           </m:e>
           <m:sup>
@@ -3761,7 +3761,7 @@
           <m:t>=</m:t>
         </m:r>
         <m:r>
-          <m:t>2.35</m:t>
+          <m:t>13.5</m:t>
         </m:r>
       </m:oMath>
       <w:r>
@@ -3827,7 +3827,7 @@
         <m:sSup>
           <m:e>
             <m:r>
-              <m:t>9.4</m:t>
+              <m:t>20.4</m:t>
             </m:r>
           </m:e>
           <m:sup>
@@ -3911,7 +3911,7 @@
           <m:t>=</m:t>
         </m:r>
         <m:r>
-          <m:t>2.82</m:t>
+          <m:t>13.0</m:t>
         </m:r>
       </m:oMath>
       <w:r>
@@ -3922,7 +3922,7 @@
       </w:r>
       <m:oMath>
         <m:r>
-          <m:t>0.00243</m:t>
+          <m:t>0.00221</m:t>
         </m:r>
       </m:oMath>
       <w:r>
@@ -3936,14 +3936,57 @@
       </w:r>
       <m:oMath>
         <m:r>
-          <m:t>0.0059</m:t>
-        </m:r>
-      </m:oMath>
-      <w:r>
-        <w:t xml:space="preserve"> </w:t>
-      </w:r>
-      <w:r>
-        <w:t xml:space="preserve">for the closed symmetric pairs. The opening angle itself is a resolution effect. A closed-form solution tells us that the cost keeps decreasing as the angle between the feature pair approaches 0, without ever reaching it, so an ideal decoder would open them by an arbitrarily small angle. However, a decoder of finite sharpness (a binned one, or a trained network) settles on a finite opening.</w:t>
+          <m:t>0.0056</m:t>
+        </m:r>
+      </m:oMath>
+      <w:r>
+        <w:t xml:space="preserve"> </w:t>
+      </w:r>
+      <w:r>
+        <w:t xml:space="preserve">for the closed symmetric pairs decoded at the same resolution (</w:t>
+      </w:r>
+      <m:oMath>
+        <m:sSup>
+          <m:e>
+            <m:r>
+              <m:t>2</m:t>
+            </m:r>
+          </m:e>
+          <m:sup>
+            <m:r>
+              <m:t>19</m:t>
+            </m:r>
+          </m:sup>
+        </m:sSup>
+      </m:oMath>
+      <w:r>
+        <w:t xml:space="preserve"> </w:t>
+      </w:r>
+      <w:r>
+        <w:t xml:space="preserve">samples,</w:t>
+      </w:r>
+      <w:r>
+        <w:t xml:space="preserve"> </w:t>
+      </w:r>
+      <m:oMath>
+        <m:r>
+          <m:t>96</m:t>
+        </m:r>
+        <m:r>
+          <m:rPr>
+            <m:sty m:val="p"/>
+          </m:rPr>
+          <m:t>×</m:t>
+        </m:r>
+        <m:r>
+          <m:t>96</m:t>
+        </m:r>
+      </m:oMath>
+      <w:r>
+        <w:t xml:space="preserve"> </w:t>
+      </w:r>
+      <w:r>
+        <w:t xml:space="preserve">bins). The opening angle and the length ratio are resolution effects. A closed-form solution tells us that the cost keeps decreasing as the angle between the feature pair approaches 0, without ever reaching it, so an ideal decoder would open them by an arbitrarily small angle. However, a decoder of finite sharpness (a binned one, or a trained network) settles on a finite opening, and the finer its resolution, the shorter the embeddings it can still read, so the length ratio grows with the resolution as well.</w:t>
       </w:r>
     </w:p>
     <w:p>
@@ -3961,9 +4004,9 @@
       <w:r>
         <w:drawing>
           <wp:inline>
-            <wp:extent cx="4962572" cy="4594974"/>
+            <wp:extent cx="5334000" cy="4989870"/>
             <wp:effectExtent b="0" l="0" r="0" t="0"/>
-            <wp:docPr descr="The geometry found by the search: the pair (f_1, f_3) opened by 11.0^\circ at length ratio 2.35, the pair (f_2, f_4) by 9.4^\circ at 2.82. Each shaded parallelogram is the region where the readings of two co-active features land; the two thin orange slivers belong to the pairs." title="" id="48" name="Picture"/>
+            <wp:docPr descr="The geometry found by the search, with a zoom on the origin as an inset: the pair (f_1, f_3) opened by 20.7^\circ at length ratio 13.5, the pair (f_2, f_4) by 20.4^\circ at 13.0. Each shaded parallelogram is the region where the readings of two co-active features land; the two thin orange slivers along the axes belong to the pairs." title="" id="48" name="Picture"/>
             <a:graphic>
               <a:graphicData uri="http://schemas.openxmlformats.org/drawingml/2006/picture">
                 <pic:pic>
@@ -3982,7 +4025,7 @@
                   <pic:spPr bwMode="auto">
                     <a:xfrm>
                       <a:off x="0" y="0"/>
-                      <a:ext cx="4962572" cy="4594974"/>
+                      <a:ext cx="5334000" cy="4989870"/>
                     </a:xfrm>
                     <a:prstGeom prst="rect">
                       <a:avLst/>
@@ -4006,7 +4049,7 @@
         <w:pStyle w:val="ImageCaption"/>
       </w:pPr>
       <w:r>
-        <w:t xml:space="preserve">The geometry found by the search: the pair</w:t>
+        <w:t xml:space="preserve">The geometry found by the search, with a zoom on the origin as an inset: the pair</w:t>
       </w:r>
       <w:r>
         <w:t xml:space="preserve"> </w:t>
@@ -4068,7 +4111,7 @@
         <m:sSup>
           <m:e>
             <m:r>
-              <m:t>11.0</m:t>
+              <m:t>20.7</m:t>
             </m:r>
           </m:e>
           <m:sup>
@@ -4092,7 +4135,7 @@
       </w:r>
       <m:oMath>
         <m:r>
-          <m:t>2.35</m:t>
+          <m:t>13.5</m:t>
         </m:r>
       </m:oMath>
       <w:r>
@@ -4158,7 +4201,7 @@
         <m:sSup>
           <m:e>
             <m:r>
-              <m:t>9.4</m:t>
+              <m:t>20.4</m:t>
             </m:r>
           </m:e>
           <m:sup>
@@ -4182,11 +4225,11 @@
       </w:r>
       <m:oMath>
         <m:r>
-          <m:t>2.82</m:t>
-        </m:r>
-      </m:oMath>
-      <w:r>
-        <w:t xml:space="preserve">. Each shaded parallelogram is the region where the readings of two co-active features land; the two thin orange slivers belong to the pairs.</w:t>
+          <m:t>13.0</m:t>
+        </m:r>
+      </m:oMath>
+      <w:r>
+        <w:t xml:space="preserve">. Each shaded parallelogram is the region where the readings of two co-active features land; the two thin orange slivers along the axes belong to the pairs.</w:t>
       </w:r>
     </w:p>
     <w:bookmarkEnd w:id="50"/>

</xml_diff>

<commit_message>
Added longer training of the deeper model
</commit_message>
<xml_diff>
--- a/lw_post.docx
+++ b/lw_post.docx
@@ -5298,6 +5298,71 @@
         <w:t xml:space="preserve">found by the search.</w:t>
       </w:r>
     </w:p>
+    <w:p>
+      <w:pPr>
+        <w:pStyle w:val="BodyText"/>
+      </w:pPr>
+      <w:r>
+        <w:t xml:space="preserve">To summarize, the best strategy needs to balance the following three mechanisms:</w:t>
+      </w:r>
+      <w:r>
+        <w:t xml:space="preserve"> </w:t>
+      </w:r>
+      <w:r>
+        <w:t xml:space="preserve">1.</w:t>
+      </w:r>
+      <w:r>
+        <w:t xml:space="preserve"> </w:t>
+      </w:r>
+      <w:r>
+        <w:rPr>
+          <w:b/>
+          <w:bCs/>
+        </w:rPr>
+        <w:t xml:space="preserve">Making the embeddings of a pair asymmetrical</w:t>
+      </w:r>
+      <w:r>
+        <w:t xml:space="preserve">, which pours most of the error into the prediction of one of them, which simultaneously reduces the overall MSE.</w:t>
+      </w:r>
+      <w:r>
+        <w:t xml:space="preserve"> </w:t>
+      </w:r>
+      <w:r>
+        <w:t xml:space="preserve">2.</w:t>
+      </w:r>
+      <w:r>
+        <w:t xml:space="preserve"> </w:t>
+      </w:r>
+      <w:r>
+        <w:rPr>
+          <w:b/>
+          <w:bCs/>
+        </w:rPr>
+        <w:t xml:space="preserve">Opening the pairs</w:t>
+      </w:r>
+      <w:r>
+        <w:t xml:space="preserve">, which makes it possible to distinguish the co-activation of two features from only one of them, or none, being active.</w:t>
+      </w:r>
+      <w:r>
+        <w:t xml:space="preserve"> </w:t>
+      </w:r>
+      <w:r>
+        <w:t xml:space="preserve">3.</w:t>
+      </w:r>
+      <w:r>
+        <w:t xml:space="preserve"> </w:t>
+      </w:r>
+      <w:r>
+        <w:rPr>
+          <w:b/>
+          <w:bCs/>
+        </w:rPr>
+        <w:t xml:space="preserve">Shortening the tilted embeddings</w:t>
+      </w:r>
+      <w:r>
+        <w:t xml:space="preserve">, which minimizes the interference with the features of the second pair.</w:t>
+      </w:r>
+    </w:p>
     <w:bookmarkEnd w:id="59"/>
     <w:bookmarkEnd w:id="60"/>
     <w:bookmarkStart w:id="81" w:name="a-models-strategy-depends-on-its-depth"/>
@@ -5377,7 +5442,7 @@
         <w:pStyle w:val="BodyText"/>
       </w:pPr>
       <w:r>
-        <w:t xml:space="preserve">To make sure the above results are not an accident, we conducted 20 training runs for each depth, from 1 to 4 bilinear MLP layers, as well as for the tied ReLU model, and checked which strategy each trained model uses:</w:t>
+        <w:t xml:space="preserve">To make sure the above results are not an accident, we conducted 20 training runs for each depth, from 1 to 4 bilinear MLP layers, as well as for the tied ReLU model, and checked which strategy each trained model uses. We used sample of size 4,096 and 20,000 training steps in each training.</w:t>
       </w:r>
     </w:p>
     <w:tbl>
@@ -6543,6 +6608,37 @@
         <w:pStyle w:val="BodyText"/>
       </w:pPr>
       <w:r>
+        <w:t xml:space="preserve">For this comparison we retrain the two representative models of the previous section (the same seeds, hence the same initializations) on a much larger sample of</w:t>
+      </w:r>
+      <w:r>
+        <w:t xml:space="preserve"> </w:t>
+      </w:r>
+      <m:oMath>
+        <m:sSup>
+          <m:e>
+            <m:r>
+              <m:t>2</m:t>
+            </m:r>
+          </m:e>
+          <m:sup>
+            <m:r>
+              <m:t>20</m:t>
+            </m:r>
+          </m:sup>
+        </m:sSup>
+      </m:oMath>
+      <w:r>
+        <w:t xml:space="preserve"> </w:t>
+      </w:r>
+      <w:r>
+        <w:t xml:space="preserve">inputs instead of the 4,096 used there, keeping the 20,000 training steps.</w:t>
+      </w:r>
+    </w:p>
+    <w:p>
+      <w:pPr>
+        <w:pStyle w:val="BodyText"/>
+      </w:pPr>
+      <w:r>
         <w:t xml:space="preserve">Below we present the binned decoders for all four features, which the model with a single bilinear MLP is supposed to reconstruct.</w:t>
       </w:r>
     </w:p>
@@ -6775,7 +6871,7 @@
         <w:pStyle w:val="BodyText"/>
       </w:pPr>
       <w:r>
-        <w:t xml:space="preserve">The analogous results for the model with four bilinear MLPs are presented below. In this case the difference between the trained model and the best fit in its class is much larger than for the single-MLP model. We attribute it to a training run that is too short for the deeper model (both models were trained for 20,000 steps).</w:t>
+        <w:t xml:space="preserve">The analogous results for the model with four bilinear MLPs are presented below. In this case the difference between the trained model and the best fit in its class is much larger than for the single-MLP model.</w:t>
       </w:r>
     </w:p>
     <w:p>
@@ -7011,7 +7107,7 @@
         <w:pStyle w:val="BodyText"/>
       </w:pPr>
       <w:r>
-        <w:t xml:space="preserve">Finally, we define two measures to put numbers on these observations:</w:t>
+        <w:t xml:space="preserve">Finally, we define two measures to quantify the above observations:</w:t>
       </w:r>
       <w:r>
         <w:t xml:space="preserve"> </w:t>
@@ -7177,7 +7273,7 @@
           <w:i/>
           <w:iCs/>
         </w:rPr>
-        <w:t xml:space="preserve">score</w:t>
+        <w:t xml:space="preserve">VAR score</w:t>
       </w:r>
       <w:r>
         <w:t xml:space="preserve"> </w:t>
@@ -7399,7 +7495,7 @@
               <w:pStyle w:val="Compact"/>
             </w:pPr>
             <w:r>
-              <w:t xml:space="preserve">score</w:t>
+              <w:t xml:space="preserve">VAR score</w:t>
             </w:r>
           </w:p>
         </w:tc>
@@ -7412,7 +7508,7 @@
               <w:pStyle w:val="Compact"/>
             </w:pPr>
             <w:r>
-              <w:t xml:space="preserve">single bilinear MLP</w:t>
+              <w:t xml:space="preserve">single bilinear MLP, 20,000 steps</w:t>
             </w:r>
           </w:p>
         </w:tc>
@@ -7423,7 +7519,7 @@
               <w:pStyle w:val="Compact"/>
             </w:pPr>
             <w:r>
-              <w:t xml:space="preserve">0.0059</w:t>
+              <w:t xml:space="preserve">0.0061</w:t>
             </w:r>
           </w:p>
         </w:tc>
@@ -7456,7 +7552,7 @@
               <w:pStyle w:val="Compact"/>
             </w:pPr>
             <w:r>
-              <w:t xml:space="preserve">0.1%</w:t>
+              <w:t xml:space="preserve">0.0%</w:t>
             </w:r>
           </w:p>
         </w:tc>
@@ -7467,7 +7563,7 @@
               <w:pStyle w:val="Compact"/>
             </w:pPr>
             <w:r>
-              <w:t xml:space="preserve">0.9998</w:t>
+              <w:t xml:space="preserve">1.000</w:t>
             </w:r>
           </w:p>
         </w:tc>
@@ -7480,7 +7576,7 @@
               <w:pStyle w:val="Compact"/>
             </w:pPr>
             <w:r>
-              <w:t xml:space="preserve">four bilinear MLPs</w:t>
+              <w:t xml:space="preserve">four bilinear MLPs, 20,000 steps</w:t>
             </w:r>
           </w:p>
         </w:tc>
@@ -7491,7 +7587,7 @@
               <w:pStyle w:val="Compact"/>
             </w:pPr>
             <w:r>
-              <w:t xml:space="preserve">0.0043</w:t>
+              <w:t xml:space="preserve">0.0036</w:t>
             </w:r>
           </w:p>
         </w:tc>
@@ -7502,7 +7598,7 @@
               <w:pStyle w:val="Compact"/>
             </w:pPr>
             <w:r>
-              <w:t xml:space="preserve">0.0045</w:t>
+              <w:t xml:space="preserve">0.0041</w:t>
             </w:r>
           </w:p>
         </w:tc>
@@ -7513,7 +7609,7 @@
               <w:pStyle w:val="Compact"/>
             </w:pPr>
             <w:r>
-              <w:t xml:space="preserve">0.0058</w:t>
+              <w:t xml:space="preserve">0.0060</w:t>
             </w:r>
           </w:p>
         </w:tc>
@@ -7524,7 +7620,7 @@
               <w:pStyle w:val="Compact"/>
             </w:pPr>
             <w:r>
-              <w:t xml:space="preserve">21.9%</w:t>
+              <w:t xml:space="preserve">31.9%</w:t>
             </w:r>
           </w:p>
         </w:tc>
@@ -7535,7 +7631,75 @@
               <w:pStyle w:val="Compact"/>
             </w:pPr>
             <w:r>
-              <w:t xml:space="preserve">0.975</w:t>
+              <w:t xml:space="preserve">0.962</w:t>
+            </w:r>
+          </w:p>
+        </w:tc>
+      </w:tr>
+      <w:tr>
+        <w:tc>
+          <w:tcPr/>
+          <w:p>
+            <w:pPr>
+              <w:pStyle w:val="Compact"/>
+            </w:pPr>
+            <w:r>
+              <w:t xml:space="preserve">four bilinear MLPs, 150,000 steps</w:t>
+            </w:r>
+          </w:p>
+        </w:tc>
+        <w:tc>
+          <w:tcPr/>
+          <w:p>
+            <w:pPr>
+              <w:pStyle w:val="Compact"/>
+            </w:pPr>
+            <w:r>
+              <w:t xml:space="preserve">0.0039</w:t>
+            </w:r>
+          </w:p>
+        </w:tc>
+        <w:tc>
+          <w:tcPr/>
+          <w:p>
+            <w:pPr>
+              <w:pStyle w:val="Compact"/>
+            </w:pPr>
+            <w:r>
+              <w:t xml:space="preserve">0.0040</w:t>
+            </w:r>
+          </w:p>
+        </w:tc>
+        <w:tc>
+          <w:tcPr/>
+          <w:p>
+            <w:pPr>
+              <w:pStyle w:val="Compact"/>
+            </w:pPr>
+            <w:r>
+              <w:t xml:space="preserve">0.0049</w:t>
+            </w:r>
+          </w:p>
+        </w:tc>
+        <w:tc>
+          <w:tcPr/>
+          <w:p>
+            <w:pPr>
+              <w:pStyle w:val="Compact"/>
+            </w:pPr>
+            <w:r>
+              <w:t xml:space="preserve">18.0%</w:t>
+            </w:r>
+          </w:p>
+        </w:tc>
+        <w:tc>
+          <w:tcPr/>
+          <w:p>
+            <w:pPr>
+              <w:pStyle w:val="Compact"/>
+            </w:pPr>
+            <w:r>
+              <w:t xml:space="preserve">0.983</w:t>
             </w:r>
           </w:p>
         </w:tc>
@@ -7546,7 +7710,35 @@
         <w:pStyle w:val="BodyText"/>
       </w:pPr>
       <w:r>
-        <w:t xml:space="preserve">These results underline once more that the shallow model is essentially the best approximation of the binned decoder that its class allows, while the deeper model comes close to it, but not as close as the shallow one.</w:t>
+        <w:t xml:space="preserve">These results underline once more that the shallow model is essentially the best approximation of the binned decoder that its class allows, while the deeper model comes close to it, but not as close as the shallow one. We attribute the remaining gap to the training itself: retraining the same model from the same initialization for 150,000 steps instead of 20,000 (last row of the table) lowers its MSE from</w:t>
+      </w:r>
+      <w:r>
+        <w:t xml:space="preserve"> </w:t>
+      </w:r>
+      <m:oMath>
+        <m:r>
+          <m:t>0.0060</m:t>
+        </m:r>
+      </m:oMath>
+      <w:r>
+        <w:t xml:space="preserve"> </w:t>
+      </w:r>
+      <w:r>
+        <w:t xml:space="preserve">to</w:t>
+      </w:r>
+      <w:r>
+        <w:t xml:space="preserve"> </w:t>
+      </w:r>
+      <m:oMath>
+        <m:r>
+          <m:t>0.0049</m:t>
+        </m:r>
+      </m:oMath>
+      <w:r>
+        <w:t xml:space="preserve"> </w:t>
+      </w:r>
+      <w:r>
+        <w:t xml:space="preserve">and halves the gap, but does not close it.</w:t>
       </w:r>
     </w:p>
     <w:bookmarkEnd w:id="103"/>
@@ -7584,50 +7776,7 @@
       </w:r>
     </w:p>
     <w:bookmarkEnd w:id="104"/>
-    <w:bookmarkStart w:id="105" w:name="future-work"/>
-    <w:p>
-      <w:pPr>
-        <w:pStyle w:val="Heading1"/>
-      </w:pPr>
-      <w:r>
-        <w:t xml:space="preserve">Future work</w:t>
-      </w:r>
-    </w:p>
-    <w:p>
-      <w:pPr>
-        <w:pStyle w:val="FirstParagraph"/>
-      </w:pPr>
-      <w:r>
-        <w:t xml:space="preserve">Below I describe my (Bartosz Rzepkowski) plans on how to extend the results presented in this work.</w:t>
-      </w:r>
-    </w:p>
-    <w:p>
-      <w:pPr>
-        <w:pStyle w:val="BodyText"/>
-      </w:pPr>
-      <w:r>
-        <w:t xml:space="preserve">In this work I analyzed the models as two parts: an encoder consisting of a single linear layer, and the remaining MLPs forming the decoder. What the individual MLPs do on their own in the whole process, however, remains unknown (although I have some candidate ideas), and this is the first avenue I want to explore in the near future.</w:t>
-      </w:r>
-    </w:p>
-    <w:p>
-      <w:pPr>
-        <w:pStyle w:val="BodyText"/>
-      </w:pPr>
-      <w:r>
-        <w:t xml:space="preserve">The reader may have noticed that throughout the analysis of the embedding space I made no reference to any</w:t>
-      </w:r>
-      <w:r>
-        <w:t xml:space="preserve"> </w:t>
-      </w:r>
-      <w:r>
-        <w:t xml:space="preserve">“neuron”</w:t>
-      </w:r>
-      <w:r>
-        <w:t xml:space="preserve">. This was a deliberate choice: with no additional constraint imposed on the model, I did not expect any part of it other than its input and output to be easily interpretable in terms of neurons, so I focused on the geometry rather than on its correspondence to the neuron basis. I want to follow the same path when analyzing the individual MLPs: geometry rather than a connection to individual neurons.</w:t>
-      </w:r>
-    </w:p>
-    <w:bookmarkEnd w:id="105"/>
-    <w:bookmarkStart w:id="106" w:name="Xc3d0042406566368190aef58e8114cef9635fc1"/>
+    <w:bookmarkStart w:id="105" w:name="Xc3d0042406566368190aef58e8114cef9635fc1"/>
     <w:p>
       <w:pPr>
         <w:pStyle w:val="Heading1"/>
@@ -10238,7 +10387,7 @@
         <w:t xml:space="preserve">this is the formula of the main text.</w:t>
       </w:r>
     </w:p>
-    <w:bookmarkEnd w:id="106"/>
+    <w:bookmarkEnd w:id="105"/>
     <w:sectPr>
       <w:footnotePr>
         <w:numRestart w:val="eachSect"/>

</xml_diff>

<commit_message>
Improved explanation of interference when decreasing embeddings length
</commit_message>
<xml_diff>
--- a/lw_post.docx
+++ b/lw_post.docx
@@ -5185,14 +5185,186 @@
     </w:p>
     <w:p>
       <w:pPr>
+        <w:pStyle w:val="BodyText"/>
+      </w:pPr>
+      <w:r>
+        <w:t xml:space="preserve">The MSE of the individual features (right panel) shows the two sides of the trade-off. At a ratio of</w:t>
+      </w:r>
+      <w:r>
+        <w:t xml:space="preserve"> </w:t>
+      </w:r>
+      <m:oMath>
+        <m:r>
+          <m:t>1</m:t>
+        </m:r>
+      </m:oMath>
+      <w:r>
+        <w:t xml:space="preserve"> </w:t>
+      </w:r>
+      <w:r>
+        <w:t xml:space="preserve">the co-active parallelograms are wide and overlap, which makes the value of a long feature ambiguous: this interference is the</w:t>
+      </w:r>
+      <w:r>
+        <w:t xml:space="preserve"> </w:t>
+      </w:r>
+      <m:oMath>
+        <m:r>
+          <m:t>0.0046</m:t>
+        </m:r>
+      </m:oMath>
+      <w:r>
+        <w:t xml:space="preserve"> </w:t>
+      </w:r>
+      <w:r>
+        <w:t xml:space="preserve">of</w:t>
+      </w:r>
+      <w:r>
+        <w:t xml:space="preserve"> </w:t>
+      </w:r>
+      <m:oMath>
+        <m:sSub>
+          <m:e>
+            <m:r>
+              <m:t>x</m:t>
+            </m:r>
+          </m:e>
+          <m:sub>
+            <m:r>
+              <m:t>3</m:t>
+            </m:r>
+          </m:sub>
+        </m:sSub>
+      </m:oMath>
+      <w:r>
+        <w:t xml:space="preserve"> </w:t>
+      </w:r>
+      <w:r>
+        <w:t xml:space="preserve">and</w:t>
+      </w:r>
+      <w:r>
+        <w:t xml:space="preserve"> </w:t>
+      </w:r>
+      <m:oMath>
+        <m:sSub>
+          <m:e>
+            <m:r>
+              <m:t>x</m:t>
+            </m:r>
+          </m:e>
+          <m:sub>
+            <m:r>
+              <m:t>4</m:t>
+            </m:r>
+          </m:sub>
+        </m:sSub>
+      </m:oMath>
+      <w:r>
+        <w:t xml:space="preserve">. As the tilted embeddings shrink, the parallelograms collapse onto the axes and this error falls to a floor of</w:t>
+      </w:r>
+      <w:r>
+        <w:t xml:space="preserve"> </w:t>
+      </w:r>
+      <m:oMath>
+        <m:r>
+          <m:t>0.0002</m:t>
+        </m:r>
+      </m:oMath>
+      <w:r>
+        <w:t xml:space="preserve"> </w:t>
+      </w:r>
+      <w:r>
+        <w:t xml:space="preserve">by a ratio of about</w:t>
+      </w:r>
+      <w:r>
+        <w:t xml:space="preserve"> </w:t>
+      </w:r>
+      <m:oMath>
+        <m:r>
+          <m:t>13</m:t>
+        </m:r>
+      </m:oMath>
+      <w:r>
+        <w:t xml:space="preserve">. The short features</w:t>
+      </w:r>
+      <w:r>
+        <w:t xml:space="preserve"> </w:t>
+      </w:r>
+      <m:oMath>
+        <m:sSub>
+          <m:e>
+            <m:r>
+              <m:t>x</m:t>
+            </m:r>
+          </m:e>
+          <m:sub>
+            <m:r>
+              <m:t>1</m:t>
+            </m:r>
+          </m:sub>
+        </m:sSub>
+      </m:oMath>
+      <w:r>
+        <w:t xml:space="preserve"> </w:t>
+      </w:r>
+      <w:r>
+        <w:t xml:space="preserve">and</w:t>
+      </w:r>
+      <w:r>
+        <w:t xml:space="preserve"> </w:t>
+      </w:r>
+      <m:oMath>
+        <m:sSub>
+          <m:e>
+            <m:r>
+              <m:t>x</m:t>
+            </m:r>
+          </m:e>
+          <m:sub>
+            <m:r>
+              <m:t>2</m:t>
+            </m:r>
+          </m:sub>
+        </m:sSub>
+      </m:oMath>
+      <w:r>
+        <w:t xml:space="preserve">, unlike in the closed pair, hardly pay for shrinking, because the decoder reads them off the line: their error rises to</w:t>
+      </w:r>
+      <w:r>
+        <w:t xml:space="preserve"> </w:t>
+      </w:r>
+      <m:oMath>
+        <m:r>
+          <m:t>0.0055</m:t>
+        </m:r>
+      </m:oMath>
+      <w:r>
+        <w:t xml:space="preserve"> </w:t>
+      </w:r>
+      <w:r>
+        <w:t xml:space="preserve">by a ratio of</w:t>
+      </w:r>
+      <w:r>
+        <w:t xml:space="preserve"> </w:t>
+      </w:r>
+      <m:oMath>
+        <m:r>
+          <m:t>2</m:t>
+        </m:r>
+      </m:oMath>
+      <w:r>
+        <w:t xml:space="preserve">, then stays flat until the embeddings become comparable to a bin, and only then climbs steeply. The minimum of the average lies where the long features have gained the most while the short ones are still on their plateau.</w:t>
+      </w:r>
+    </w:p>
+    <w:p>
+      <w:pPr>
         <w:pStyle w:val="CaptionedFigure"/>
       </w:pPr>
       <w:r>
         <w:drawing>
           <wp:inline>
-            <wp:extent cx="5334000" cy="3118338"/>
+            <wp:extent cx="5334000" cy="1842654"/>
             <wp:effectExtent b="0" l="0" r="0" t="0"/>
-            <wp:docPr descr="The MSE of the binned decoders with both pairs opened by the angles found by the search (20.7^\circ and 20.4^\circ), as a function of the length ratio, for three resolutions (triangles mark the minima). The dashed line marks the ratio 13 found by the search." title="" id="57" name="Picture"/>
+            <wp:docPr descr="The MSE of the binned decoders with both pairs opened by the angles found by the search (20.7^\circ and 20.4^\circ), as a function of the length ratio. Left: averaged over the four features, for three resolutions (triangles mark the minima). Right: the MSE of each feature on its own and their average, with 96 bins per axis. The dashed line marks the ratio 13 found by the search." title="" id="57" name="Picture"/>
             <a:graphic>
               <a:graphicData uri="http://schemas.openxmlformats.org/drawingml/2006/picture">
                 <pic:pic>
@@ -5211,7 +5383,7 @@
                   <pic:spPr bwMode="auto">
                     <a:xfrm>
                       <a:off x="0" y="0"/>
-                      <a:ext cx="5334000" cy="3118338"/>
+                      <a:ext cx="5334000" cy="1842654"/>
                     </a:xfrm>
                     <a:prstGeom prst="rect">
                       <a:avLst/>
@@ -5281,7 +5453,21 @@
         </m:sSup>
       </m:oMath>
       <w:r>
-        <w:t xml:space="preserve">), as a function of the length ratio, for three resolutions (triangles mark the minima). The dashed line marks the ratio</w:t>
+        <w:t xml:space="preserve">), as a function of the length ratio. Left: averaged over the four features, for three resolutions (triangles mark the minima). Right: the MSE of each feature on its own and their average, with</w:t>
+      </w:r>
+      <w:r>
+        <w:t xml:space="preserve"> </w:t>
+      </w:r>
+      <m:oMath>
+        <m:r>
+          <m:t>96</m:t>
+        </m:r>
+      </m:oMath>
+      <w:r>
+        <w:t xml:space="preserve"> </w:t>
+      </w:r>
+      <w:r>
+        <w:t xml:space="preserve">bins per axis. The dashed line marks the ratio</w:t>
       </w:r>
       <w:r>
         <w:t xml:space="preserve"> </w:t>

</xml_diff>

<commit_message>
Added panel checking if asymmetry still helps within pair for open pair
</commit_message>
<xml_diff>
--- a/lw_post.docx
+++ b/lw_post.docx
@@ -5188,7 +5188,7 @@
         <w:pStyle w:val="BodyText"/>
       </w:pPr>
       <w:r>
-        <w:t xml:space="preserve">The MSE of the individual features (right panel) shows the two sides of the trade-off. At a ratio of</w:t>
+        <w:t xml:space="preserve">The MSE of the individual features (middle panel) shows the two sides of the trade-off. At a ratio of</w:t>
       </w:r>
       <w:r>
         <w:t xml:space="preserve"> </w:t>
@@ -5357,14 +5357,100 @@
     </w:p>
     <w:p>
       <w:pPr>
+        <w:pStyle w:val="BodyText"/>
+      </w:pPr>
+      <w:r>
+        <w:t xml:space="preserve">We also checked whether the claim from the</w:t>
+      </w:r>
+      <w:r>
+        <w:t xml:space="preserve"> </w:t>
+      </w:r>
+      <w:r>
+        <w:t xml:space="preserve">“Asymmetrical antipodal encoding”</w:t>
+      </w:r>
+      <w:r>
+        <w:t xml:space="preserve"> </w:t>
+      </w:r>
+      <w:r>
+        <w:t xml:space="preserve">section still holds, i.e., whether asymmetry helps within the pair itself, this time with opened embeddings. In the right panel we show the sum of the MSEs of the two features of each pair. It turns out that the asymmetry pays off far more than for the closed pair: the MSE of</w:t>
+      </w:r>
+      <w:r>
+        <w:t xml:space="preserve"> </w:t>
+      </w:r>
+      <m:oMath>
+        <m:sSub>
+          <m:e>
+            <m:r>
+              <m:t>x</m:t>
+            </m:r>
+          </m:e>
+          <m:sub>
+            <m:r>
+              <m:t>1</m:t>
+            </m:r>
+          </m:sub>
+        </m:sSub>
+        <m:r>
+          <m:rPr>
+            <m:sty m:val="p"/>
+          </m:rPr>
+          <m:t>+</m:t>
+        </m:r>
+        <m:sSub>
+          <m:e>
+            <m:r>
+              <m:t>x</m:t>
+            </m:r>
+          </m:e>
+          <m:sub>
+            <m:r>
+              <m:t>3</m:t>
+            </m:r>
+          </m:sub>
+        </m:sSub>
+      </m:oMath>
+      <w:r>
+        <w:t xml:space="preserve"> </w:t>
+      </w:r>
+      <w:r>
+        <w:t xml:space="preserve">drops from</w:t>
+      </w:r>
+      <w:r>
+        <w:t xml:space="preserve"> </w:t>
+      </w:r>
+      <m:oMath>
+        <m:r>
+          <m:t>0.0091</m:t>
+        </m:r>
+      </m:oMath>
+      <w:r>
+        <w:t xml:space="preserve"> </w:t>
+      </w:r>
+      <w:r>
+        <w:t xml:space="preserve">to</w:t>
+      </w:r>
+      <w:r>
+        <w:t xml:space="preserve"> </w:t>
+      </w:r>
+      <m:oMath>
+        <m:r>
+          <m:t>0.0055</m:t>
+        </m:r>
+      </m:oMath>
+      <w:r>
+        <w:t xml:space="preserve">, and rises again only at the resolution limit.</w:t>
+      </w:r>
+    </w:p>
+    <w:p>
+      <w:pPr>
         <w:pStyle w:val="CaptionedFigure"/>
       </w:pPr>
       <w:r>
         <w:drawing>
           <wp:inline>
-            <wp:extent cx="5334000" cy="1842654"/>
+            <wp:extent cx="5334000" cy="1266825"/>
             <wp:effectExtent b="0" l="0" r="0" t="0"/>
-            <wp:docPr descr="The MSE of the binned decoders with both pairs opened by the angles found by the search (20.7^\circ and 20.4^\circ), as a function of the length ratio. Left: averaged over the four features, for three resolutions (triangles mark the minima). Right: the MSE of each feature on its own and their average, with 96 bins per axis. The dashed line marks the ratio 13 found by the search." title="" id="57" name="Picture"/>
+            <wp:docPr descr="The MSE of the binned decoders with both pairs opened by the angles found by the search (20.7^\circ and 20.4^\circ), as a function of the length ratio. Left: averaged over the four features, for three resolutions (triangles mark the minima). Middle: the MSE of each feature on its own and their average, with 96 bins per axis. Right: the MSE summed over the two features of each pair, as in the closed-pair sweep. The dashed line marks the ratio 13 found by the search." title="" id="57" name="Picture"/>
             <a:graphic>
               <a:graphicData uri="http://schemas.openxmlformats.org/drawingml/2006/picture">
                 <pic:pic>
@@ -5383,7 +5469,7 @@
                   <pic:spPr bwMode="auto">
                     <a:xfrm>
                       <a:off x="0" y="0"/>
-                      <a:ext cx="5334000" cy="1842654"/>
+                      <a:ext cx="5334000" cy="1266825"/>
                     </a:xfrm>
                     <a:prstGeom prst="rect">
                       <a:avLst/>
@@ -5453,7 +5539,7 @@
         </m:sSup>
       </m:oMath>
       <w:r>
-        <w:t xml:space="preserve">), as a function of the length ratio. Left: averaged over the four features, for three resolutions (triangles mark the minima). Right: the MSE of each feature on its own and their average, with</w:t>
+        <w:t xml:space="preserve">), as a function of the length ratio. Left: averaged over the four features, for three resolutions (triangles mark the minima). Middle: the MSE of each feature on its own and their average, with</w:t>
       </w:r>
       <w:r>
         <w:t xml:space="preserve"> </w:t>
@@ -5467,7 +5553,7 @@
         <w:t xml:space="preserve"> </w:t>
       </w:r>
       <w:r>
-        <w:t xml:space="preserve">bins per axis. The dashed line marks the ratio</w:t>
+        <w:t xml:space="preserve">bins per axis. Right: the MSE summed over the two features of each pair, as in the closed-pair sweep. The dashed line marks the ratio</w:t>
       </w:r>
       <w:r>
         <w:t xml:space="preserve"> </w:t>

</xml_diff>